<commit_message>
Sincroniza con la version final de Jimmy del taller de algebra lineal
Incluye el punto 2 resuelto con Gauss, LU y QR, y los resultados finales.

Co-authored-by: Jimmy Alexander Calderon Trujillo <su-correo@github>
</commit_message>
<xml_diff>
--- a/Informe/Informe_Taller_Algebra_Lineal_Numerica_Jimmy_Sebastian.docx
+++ b/Informe/Informe_Taller_Algebra_Lineal_Numerica_Jimmy_Sebastian.docx
@@ -76,10 +76,7 @@
         <w:jc w:val="center"/>
       </w:pPr>
       <w:r>
-        <w:rPr>
-          <w:i/>
-        </w:rPr>
-        <w:t>Nota: el Punto 2 se deja pendiente, ya que el enunciado suministra la matriz A de 10×10 pero no especifica el vector independiente b necesario para obtener una solución única del sistema.</w:t>
+        <w:t>Nota: como el enunciado del Punto 2 suministra la matriz A de 10×10 pero no especifica el vector independiente b, para completar la comparación numérica se asumió explícitamente b = [1,2,3,4,5,6,7,8,9,10]ᵀ.</w:t>
       </w:r>
     </w:p>
     <w:p>
@@ -183,7 +180,7 @@
     </w:p>
     <w:p>
       <w:r>
-        <w:t>Las cuatro condiciones se verificaron numéricamente en Octave y en Eigen3. Las diferencias observadas fueron del orden del error de redondeo de punto flotante (aproximadamente 10⁻¹⁶), por lo que pueden considerarse cero numérico. Ambos entornos produjeron la misma pseudoinversa dentro de la precisión disponible.</w:t>
+        <w:t>Las cuatro condiciones se verificaron numéricamente en Octave y en Eigen3. Los errores obtenidos estuvieron aproximadamente entre 10⁻¹⁵ y 10⁻¹⁶, magnitudes compatibles con el redondeo de punto flotante, por lo que puede considerarse que las cuatro propiedades de Moore-Penrose se satisfacen numéricamente.</w:t>
       </w:r>
     </w:p>
     <w:p>
@@ -391,7 +388,7 @@
           </w:tcPr>
           <w:p>
             <w:r>
-              <w:t>5.9241 × 10⁻¹²</w:t>
+              <w:t>6.19865 × 10⁻¹²</w:t>
             </w:r>
           </w:p>
         </w:tc>
@@ -423,7 +420,7 @@
           </w:tcPr>
           <w:p>
             <w:r>
-              <w:t>2.7371 × 10⁻¹¹</w:t>
+              <w:t>2.74385 × 10⁻¹¹</w:t>
             </w:r>
           </w:p>
         </w:tc>
@@ -455,7 +452,7 @@
           </w:tcPr>
           <w:p>
             <w:r>
-              <w:t>3.2090 × 10⁻¹¹</w:t>
+              <w:t>3.21896 × 10⁻¹¹</w:t>
             </w:r>
           </w:p>
         </w:tc>
@@ -927,7 +924,7 @@
     </w:tbl>
     <w:p>
       <w:r>
-        <w:t>El número de condición de X es aproximadamente 347.22. Esto evidencia sensibilidad numérica apreciable, aunque muy inferior a la observada en la matriz de Hilbert del Punto 3. Los resultados de Octave y Eigen3 coinciden dentro del redondeo mostrado.</w:t>
+        <w:t>Se calculó explícitamente el vector residual r = y - Xβ̂ para las 100 observaciones. Como indicadores resumidos se obtuvo ||r||₂ = 155.040807, un error cuadrático medio MSE = 240.376517 y un residuo absoluto máximo de 47.957115. El número de condición de X es aproximadamente 347.22. Esto evidencia una sensibilidad numérica apreciable, aunque muy inferior a la observada en la matriz de Hilbert del Punto 3. Los resultados de Octave y Eigen3 coinciden dentro de la precisión numérica.</w:t>
       </w:r>
     </w:p>
     <w:p>
@@ -1170,17 +1167,21 @@
         <w:pStyle w:val="Heading1"/>
       </w:pPr>
       <w:r>
-        <w:t>6. Punto 2 – Estado pendiente</w:t>
+        <w:t>6. Punto 2 – Sistema lineal 10×10: Gauss, LU y QR</w:t>
       </w:r>
     </w:p>
     <w:p>
       <w:r>
-        <w:t>El enunciado proporciona una matriz A de 10×10 y solicita resolver el sistema mediante eliminación de Gauss, factorización LU y factorización QR, comparando estabilidad y eficiencia. Sin embargo, no suministra el vector independiente b. Por esta razón no se presenta una solución x inventando datos que no aparecen en el enunciado.</w:t>
+        <w:t>El enunciado proporciona la matriz de coeficientes A de dimensión 10×10 pero no especifica el vector independiente b. Para completar el ejercicio y poder comparar los métodos, se asumió b = [1,2,3,4,5,6,7,8,9,10]ᵀ. Esta elección se realizó únicamente con fines de análisis numérico y se declara de forma explícita para no atribuirla al enunciado original.</w:t>
       </w:r>
     </w:p>
     <w:p>
       <w:r>
-        <w:t>Como avance, la implementación preparada obtuvo errores de reconstrucción de aproximadamente 2.07704×10⁻¹⁵ para LU y 7.52197×10⁻¹⁵ para QR, y un número de condición de A de aproximadamente 51.715. La solución definitiva queda pendiente de la definición de b por parte del profesor.</w:t>
+        <w:t>El sistema se resolvió mediante eliminación gaussiana con pivoteo parcial, factorización LU y factorización QR. Los tres métodos produjeron, dentro de la precisión numérica, la misma solución:</w:t>
+        <w:br/>
+        <w:t>x ≈ [-0.5402100241, -4.1975720146, -2.1442633550, -4.0005796843, 3.1458128957, 1.3559261571, 3.5632413270, -2.4104833675, 3.1812739677, 3.0679679836]ᵀ.</w:t>
+        <w:br/>
+        <w:t>En C++/Eigen3 los residuos fueron 8.57×10⁻¹⁵ (Gauss), 1.29×10⁻¹⁴ (LU) y 2.12×10⁻¹⁴ (QR). En Octave fueron 6.40×10⁻¹⁵ (A\b), 6.40×10⁻¹⁵ (LU) y 1.56×10⁻¹⁴ (QR). El número de condición fue κ(A) ≈ 51.715, lo que indica un condicionamiento moderado. Las diferencias entre soluciones fueron nulas o del orden de 10⁻¹⁵. Para una matriz tan pequeña, los tiempos de una sola ejecución no deben interpretarse como una comparación universal de rendimiento; LU resulta especialmente útil cuando se reutiliza la misma matriz con varios vectores b, mientras que QR ofrece buenas propiedades de estabilidad numérica.</w:t>
       </w:r>
     </w:p>
     <w:p>
@@ -1196,6 +1197,7 @@
         <w:t>La pseudoinversa de Moore-Penrose fue reproducida consistentemente en Octave y Eigen3 y satisfizo sus cuatro propiedades dentro de la precisión de punto flotante.</w:t>
       </w:r>
     </w:p>
+    <CT_P/>
     <w:p>
       <w:r>
         <w:t>La matriz de Hilbert evidenció el efecto del mal condicionamiento: una perturbación de 10⁻⁵ en b produjo un error relativo cercano al 0.84 % en la solución.</w:t>
@@ -1217,6 +1219,12 @@
       </w:r>
     </w:p>
     <w:p>
+      <w:pPr/>
+      <w:r>
+        <w:t>Para el sistema 10×10, Gauss, LU y QR produjeron soluciones prácticamente idénticas y residuos del orden de 10⁻¹⁴–10⁻¹⁵. El número de condición κ(A) ≈ 51.715 indica un condicionamiento moderado.</w:t>
+      </w:r>
+    </w:p>
+    <w:p>
       <w:pPr>
         <w:pStyle w:val="Heading1"/>
       </w:pPr>
@@ -1226,7 +1234,7 @@
     </w:p>
     <w:p>
       <w:r>
-        <w:t>Para la entrega se recomienda adjuntar este informe junto con el repositorio/branch que contiene los códigos C++/Eigen3, el archivo CMakeLists.txt y el archivo CSV de 100 muestras. El Punto 2 debe completarse cuando se disponga del vector b.</w:t>
+        <w:t>Para la entrega se recomienda adjuntar este informe junto con el repositorio/branch que contiene los códigos C++/Eigen3, los scripts de Octave, el archivo CMakeLists.txt y el archivo CSV de 100 muestras. Los cinco puntos quedan desarrollados; en el Punto 2 se declara explícitamente que el vector b fue asumido por los autores para completar la comparación.</w:t>
       </w:r>
     </w:p>
     <w:tbl>
@@ -1322,7 +1330,7 @@
           </w:tcPr>
           <w:p>
             <w:r>
-              <w:t>Pendiente de b</w:t>
+              <w:t>Completo</w:t>
             </w:r>
           </w:p>
         </w:tc>
@@ -1332,7 +1340,7 @@
           </w:tcPr>
           <w:p>
             <w:r>
-              <w:t>punto2_sistema_10x10.cpp (avance)</w:t>
+              <w:t>punto2_sistema_10x10.cpp + Octave/punto2_sistema_10x10.m</w:t>
             </w:r>
           </w:p>
         </w:tc>
@@ -1428,7 +1436,7 @@
           </w:tcPr>
           <w:p>
             <w:r>
-              <w:t>punto5_minimos_cuadrados.cpp + datos_convertidor_realista.csv</w:t>
+              <w:t>punto5_minimos_cuadrados.cpp + datos_convertidor_realista.csv + script Octave</w:t>
             </w:r>
           </w:p>
         </w:tc>

</xml_diff>